<commit_message>
Add phase 3 proctor PDF document to documentation
</commit_message>
<xml_diff>
--- a/docs/phase3-participants.docx
+++ b/docs/phase3-participants.docx
@@ -424,6 +424,156 @@
         <w:pStyle w:val="Heading2"/>
       </w:pPr>
       <w:r>
+        <w:t>Step 7: Create Project Documentation (10-15 min)</w:t>
+      </w:r>
+    </w:p>
+    <w:p>
+      <w:r>
+        <w:t>Before final demos, create three markdown files so someone new can run and understand your project quickly.</w:t>
+      </w:r>
+    </w:p>
+    <w:p>
+      <w:pPr>
+        <w:pStyle w:val="ListNumber"/>
+      </w:pPr>
+      <w:r>
+        <w:t>`README.md` (overall project overview)</w:t>
+      </w:r>
+    </w:p>
+    <w:p>
+      <w:pPr>
+        <w:pStyle w:val="ListBullet"/>
+      </w:pPr>
+      <w:r>
+        <w:t>What the app does and which document type it validates</w:t>
+      </w:r>
+    </w:p>
+    <w:p>
+      <w:pPr>
+        <w:pStyle w:val="ListBullet"/>
+      </w:pPr>
+      <w:r>
+        <w:t>How to run the app locally</w:t>
+      </w:r>
+    </w:p>
+    <w:p>
+      <w:pPr>
+        <w:pStyle w:val="ListBullet"/>
+      </w:pPr>
+      <w:r>
+        <w:t>Where the API and frontend live</w:t>
+      </w:r>
+    </w:p>
+    <w:p>
+      <w:pPr>
+        <w:pStyle w:val="ListBullet"/>
+      </w:pPr>
+      <w:r>
+        <w:t>Quick summary of Playwright coverage</w:t>
+      </w:r>
+    </w:p>
+    <w:p>
+      <w:pPr>
+        <w:pStyle w:val="ListNumber"/>
+      </w:pPr>
+      <w:r>
+        <w:t>`TESTING.md` (how to test)</w:t>
+      </w:r>
+    </w:p>
+    <w:p>
+      <w:pPr>
+        <w:pStyle w:val="ListBullet"/>
+      </w:pPr>
+      <w:r>
+        <w:t>Playwright install/setup command(s)</w:t>
+      </w:r>
+    </w:p>
+    <w:p>
+      <w:pPr>
+        <w:pStyle w:val="ListBullet"/>
+      </w:pPr>
+      <w:r>
+        <w:t>How to run all tests and a single test</w:t>
+      </w:r>
+    </w:p>
+    <w:p>
+      <w:pPr>
+        <w:pStyle w:val="ListBullet"/>
+      </w:pPr>
+      <w:r>
+        <w:t>Test folder structure and fixture location (`test-data/`)</w:t>
+      </w:r>
+    </w:p>
+    <w:p>
+      <w:pPr>
+        <w:pStyle w:val="ListBullet"/>
+      </w:pPr>
+      <w:r>
+        <w:t>Common test failure tips (selector issues, timing, local server not running)</w:t>
+      </w:r>
+    </w:p>
+    <w:p>
+      <w:pPr>
+        <w:pStyle w:val="ListNumber"/>
+      </w:pPr>
+      <w:r>
+        <w:t>`techOverview.md` (technical details)</w:t>
+      </w:r>
+    </w:p>
+    <w:p>
+      <w:pPr>
+        <w:pStyle w:val="ListBullet"/>
+      </w:pPr>
+      <w:r>
+        <w:t>Stack and key libraries</w:t>
+      </w:r>
+    </w:p>
+    <w:p>
+      <w:pPr>
+        <w:pStyle w:val="ListBullet"/>
+      </w:pPr>
+      <w:r>
+        <w:t>High-level architecture (frontend -&gt; API -&gt; validation)</w:t>
+      </w:r>
+    </w:p>
+    <w:p>
+      <w:pPr>
+        <w:pStyle w:val="ListBullet"/>
+      </w:pPr>
+      <w:r>
+        <w:t>Validation rules implemented</w:t>
+      </w:r>
+    </w:p>
+    <w:p>
+      <w:pPr>
+        <w:pStyle w:val="ListBullet"/>
+      </w:pPr>
+      <w:r>
+        <w:t>Known limitations and next improvements</w:t>
+      </w:r>
+    </w:p>
+    <w:p>
+      <w:r>
+        <w:t>Keep these docs concise and practical. Aim for clear run instructions someone can follow in under 10 minutes.</w:t>
+      </w:r>
+    </w:p>
+    <w:p>
+      <w:pPr>
+        <w:ind w:left="720"/>
+      </w:pPr>
+      <w:r>
+        <w:rPr>
+          <w:i/>
+        </w:rPr>
+        <w:t>**Copilot tip:** *"Generate README.md, TESTING.md, and techOverview.md for this project. Keep each file concise and include exact run/test commands for my stack."*</w:t>
+      </w:r>
+    </w:p>
+    <w:p/>
+    <w:p>
+      <w:pPr>
+        <w:pStyle w:val="Heading2"/>
+      </w:pPr>
+      <w:r>
         <w:t>Optional Stretch Goals</w:t>
       </w:r>
     </w:p>
@@ -516,6 +666,14 @@
       </w:pPr>
       <w:r>
         <w:t>[ ] Demo rehearsed — you know your 5-minute story</w:t>
+      </w:r>
+    </w:p>
+    <w:p>
+      <w:pPr>
+        <w:pStyle w:val="ListBullet"/>
+      </w:pPr>
+      <w:r>
+        <w:t>[ ] Documentation created: `README.md`, `TESTING.md`, and `techOverview.md`</w:t>
       </w:r>
     </w:p>
     <w:p>

</xml_diff>